<commit_message>
Word-Export: Excel-Zeitentabelle durch eigene Word-Tabelle ersetzen
Die eingebettete Excel-Arbeitsmappe (OLE-Objekt) in der Vorlage ist durch
eine normale Word-Tabelle mit denselben Spalten ersetzt: Datum, Techniker,
Anfahrt (Fahrzeit/Km), Arbeitszeit (von/bis/Stunden/Ü-Std./Pause),
Abfahrt (Fahrzeit/Km) und eine Gesamt-Zeile.

- Eine Zeile pro Tag (docxtemplater-Loop {#timeRows}), keine 15-Zeilen-
  Grenze mehr, keine erst in Excel neu zu rechnenden Formeln.
- Werte berechnet timesheetRows.ts: Stunden = Projektzeit ohne Fahrzeit
  (Pause bereits abgezogen), Ü-Std. = alles über 8 Std. von Fahrzeit +
  Arbeitszeit, Hin-/Rückfahrt wie bei den Buttons (isReturnTravelAmong()
  jetzt als reine Funktion in utils/travel.ts).
- Pausen werden für den Export über das Datum geladen (listBreaksForDates).
- timesheetEmbed.ts und die cfb-Abhängigkeit entfallen.

Co-Authored-By: Claude Opus 5.5 <noreply@anthropic.com>
Claude-Session: https://claude.ai/code/session_01EybqrHsg2q7ATcARtdNLm1
</commit_message>
<xml_diff>
--- a/src/assets/templates/servicebericht-vorlage.docx
+++ b/src/assets/templates/servicebericht-vorlage.docx
@@ -3182,48 +3182,1002 @@
         </w:rPr>
       </w:pPr>
     </w:p>
-    <w:p>
-      <w:r>
-        <w:lastRenderedPageBreak/>
-        <w:t xml:space="preserve">    </w:t>
-      </w:r>
-      <w:r>
-        <w:t xml:space="preserve">  </w:t>
-      </w:r>
-      <w:r>
-        <w:t xml:space="preserve"> </w:t>
-      </w:r>
-      <w:bookmarkStart w:id="4" w:name="_MON_1824269125"/>
-      <w:bookmarkEnd w:id="4"/>
-      <w:r>
-        <w:object w:dxaOrig="12930" w:dyaOrig="3954" w14:anchorId="66C0E614">
-          <v:shapetype id="_x0000_t75" coordsize="21600,21600" o:spt="75" o:preferrelative="t" path="m@4@5l@4@11@9@11@9@5xe" filled="f" stroked="f">
-            <v:stroke joinstyle="miter"/>
-            <v:formulas>
-              <v:f eqn="if lineDrawn pixelLineWidth 0"/>
-              <v:f eqn="sum @0 1 0"/>
-              <v:f eqn="sum 0 0 @1"/>
-              <v:f eqn="prod @2 1 2"/>
-              <v:f eqn="prod @3 21600 pixelWidth"/>
-              <v:f eqn="prod @3 21600 pixelHeight"/>
-              <v:f eqn="sum @0 0 1"/>
-              <v:f eqn="prod @6 1 2"/>
-              <v:f eqn="prod @7 21600 pixelWidth"/>
-              <v:f eqn="sum @8 21600 0"/>
-              <v:f eqn="prod @7 21600 pixelHeight"/>
-              <v:f eqn="sum @10 21600 0"/>
-            </v:formulas>
-            <v:path o:extrusionok="f" gradientshapeok="t" o:connecttype="rect"/>
-            <o:lock v:ext="edit" aspectratio="t"/>
-          </v:shapetype>
-          <v:shape id="_x0000_i1025" type="#_x0000_t75" style="width:517.1pt;height:165.5pt" o:ole="">
-            <v:imagedata r:id="rId20" o:title="" cropright="22804f"/>
-            <o:lock v:ext="edit" aspectratio="f"/>
-          </v:shape>
-          <o:OLEObject Type="Embed" ProgID="Excel.Sheet.8" ShapeID="_x0000_i1025" DrawAspect="Content" ObjectID="_1848649509" r:id="rId21"/>
-        </w:object>
-      </w:r>
-    </w:p>
+    <w:tbl>
+      <w:tblPr>
+        <w:tblW w:w="10079" w:type="dxa"/>
+        <w:tblInd w:w="438" w:type="dxa"/>
+        <w:tblBorders>
+          <w:top w:val="single" w:sz="8" w:space="0" w:color="000000" w:themeColor="text1"/>
+          <w:left w:val="single" w:sz="8" w:space="0" w:color="000000" w:themeColor="text1"/>
+          <w:bottom w:val="single" w:sz="8" w:space="0" w:color="000000" w:themeColor="text1"/>
+          <w:right w:val="single" w:sz="8" w:space="0" w:color="000000" w:themeColor="text1"/>
+          <w:insideH w:val="single" w:sz="8" w:space="0" w:color="000000" w:themeColor="text1"/>
+          <w:insideV w:val="single" w:sz="8" w:space="0" w:color="000000" w:themeColor="text1"/>
+        </w:tblBorders>
+        <w:tblLayout w:type="fixed"/>
+        <w:tblCellMar>
+          <w:left w:w="57" w:type="dxa"/>
+          <w:right w:w="57" w:type="dxa"/>
+        </w:tblCellMar>
+        <w:tblLook w:val="04A0" w:firstRow="1" w:lastRow="0" w:firstColumn="1" w:lastColumn="0" w:noHBand="0" w:noVBand="1"/>
+      </w:tblPr>
+      <w:tblGrid>
+        <w:gridCol w:w="1060"/>
+        <w:gridCol w:w="1799"/>
+        <w:gridCol w:w="820"/>
+        <w:gridCol w:w="700"/>
+        <w:gridCol w:w="820"/>
+        <w:gridCol w:w="820"/>
+        <w:gridCol w:w="900"/>
+        <w:gridCol w:w="820"/>
+        <w:gridCol w:w="820"/>
+        <w:gridCol w:w="820"/>
+        <w:gridCol w:w="700"/>
+      </w:tblGrid>
+      <w:tr>
+        <w:trPr>
+          <w:cantSplit/>
+          <w:tblHeader/>
+        </w:trPr>
+        <w:tc>
+          <w:tcPr>
+            <w:tcW w:w="1060" w:type="dxa"/>
+            <w:vMerge w:val="restart"/>
+            <w:vAlign w:val="center"/>
+          </w:tcPr>
+          <w:p>
+            <w:pPr>
+              <w:spacing w:before="20" w:after="20" w:line="240" w:lineRule="auto"/>
+              <w:jc w:val="center"/>
+              <w:rPr>
+                <w:rFonts w:ascii="Arial" w:hAnsi="Arial" w:cs="Arial"/>
+                <w:b/>
+                <w:bCs/>
+                <w:sz w:val="16"/>
+                <w:szCs w:val="16"/>
+              </w:rPr>
+            </w:pPr>
+            <w:r>
+              <w:rPr>
+                <w:rFonts w:ascii="Arial" w:hAnsi="Arial" w:cs="Arial"/>
+                <w:b/>
+                <w:bCs/>
+                <w:sz w:val="16"/>
+                <w:szCs w:val="16"/>
+              </w:rPr>
+              <w:t xml:space="preserve">Datum</w:t>
+            </w:r>
+          </w:p>
+        </w:tc>
+        <w:tc>
+          <w:tcPr>
+            <w:tcW w:w="1799" w:type="dxa"/>
+            <w:vMerge w:val="restart"/>
+            <w:vAlign w:val="center"/>
+          </w:tcPr>
+          <w:p>
+            <w:pPr>
+              <w:spacing w:before="20" w:after="20" w:line="240" w:lineRule="auto"/>
+              <w:jc w:val="center"/>
+              <w:rPr>
+                <w:rFonts w:ascii="Arial" w:hAnsi="Arial" w:cs="Arial"/>
+                <w:b/>
+                <w:bCs/>
+                <w:sz w:val="16"/>
+                <w:szCs w:val="16"/>
+              </w:rPr>
+            </w:pPr>
+            <w:r>
+              <w:rPr>
+                <w:rFonts w:ascii="Arial" w:hAnsi="Arial" w:cs="Arial"/>
+                <w:b/>
+                <w:bCs/>
+                <w:sz w:val="16"/>
+                <w:szCs w:val="16"/>
+              </w:rPr>
+              <w:t xml:space="preserve">Techniker</w:t>
+            </w:r>
+          </w:p>
+        </w:tc>
+        <w:tc>
+          <w:tcPr>
+            <w:tcW w:w="1520" w:type="dxa"/>
+            <w:gridSpan w:val="2"/>
+            <w:vAlign w:val="center"/>
+          </w:tcPr>
+          <w:p>
+            <w:pPr>
+              <w:spacing w:before="20" w:after="20" w:line="240" w:lineRule="auto"/>
+              <w:jc w:val="center"/>
+              <w:rPr>
+                <w:rFonts w:ascii="Arial" w:hAnsi="Arial" w:cs="Arial"/>
+                <w:b/>
+                <w:bCs/>
+                <w:sz w:val="16"/>
+                <w:szCs w:val="16"/>
+              </w:rPr>
+            </w:pPr>
+            <w:r>
+              <w:rPr>
+                <w:rFonts w:ascii="Arial" w:hAnsi="Arial" w:cs="Arial"/>
+                <w:b/>
+                <w:bCs/>
+                <w:sz w:val="16"/>
+                <w:szCs w:val="16"/>
+              </w:rPr>
+              <w:t xml:space="preserve">Anfahrt</w:t>
+            </w:r>
+          </w:p>
+        </w:tc>
+        <w:tc>
+          <w:tcPr>
+            <w:tcW w:w="4180" w:type="dxa"/>
+            <w:gridSpan w:val="5"/>
+            <w:vAlign w:val="center"/>
+          </w:tcPr>
+          <w:p>
+            <w:pPr>
+              <w:spacing w:before="20" w:after="20" w:line="240" w:lineRule="auto"/>
+              <w:jc w:val="center"/>
+              <w:rPr>
+                <w:rFonts w:ascii="Arial" w:hAnsi="Arial" w:cs="Arial"/>
+                <w:b/>
+                <w:bCs/>
+                <w:sz w:val="16"/>
+                <w:szCs w:val="16"/>
+              </w:rPr>
+            </w:pPr>
+            <w:r>
+              <w:rPr>
+                <w:rFonts w:ascii="Arial" w:hAnsi="Arial" w:cs="Arial"/>
+                <w:b/>
+                <w:bCs/>
+                <w:sz w:val="16"/>
+                <w:szCs w:val="16"/>
+              </w:rPr>
+              <w:t xml:space="preserve">Arbeitszeit</w:t>
+            </w:r>
+          </w:p>
+        </w:tc>
+        <w:tc>
+          <w:tcPr>
+            <w:tcW w:w="1520" w:type="dxa"/>
+            <w:gridSpan w:val="2"/>
+            <w:vAlign w:val="center"/>
+          </w:tcPr>
+          <w:p>
+            <w:pPr>
+              <w:spacing w:before="20" w:after="20" w:line="240" w:lineRule="auto"/>
+              <w:jc w:val="center"/>
+              <w:rPr>
+                <w:rFonts w:ascii="Arial" w:hAnsi="Arial" w:cs="Arial"/>
+                <w:b/>
+                <w:bCs/>
+                <w:sz w:val="16"/>
+                <w:szCs w:val="16"/>
+              </w:rPr>
+            </w:pPr>
+            <w:r>
+              <w:rPr>
+                <w:rFonts w:ascii="Arial" w:hAnsi="Arial" w:cs="Arial"/>
+                <w:b/>
+                <w:bCs/>
+                <w:sz w:val="16"/>
+                <w:szCs w:val="16"/>
+              </w:rPr>
+              <w:t xml:space="preserve">Abfahrt</w:t>
+            </w:r>
+          </w:p>
+        </w:tc>
+      </w:tr>
+      <w:tr>
+        <w:trPr>
+          <w:cantSplit/>
+          <w:tblHeader/>
+        </w:trPr>
+        <w:tc>
+          <w:tcPr>
+            <w:tcW w:w="1060" w:type="dxa"/>
+            <w:vMerge/>
+            <w:vAlign w:val="center"/>
+          </w:tcPr>
+          <w:p>
+            <w:pPr>
+              <w:spacing w:before="20" w:after="20" w:line="240" w:lineRule="auto"/>
+              <w:jc w:val="center"/>
+              <w:rPr>
+                <w:rFonts w:ascii="Arial" w:hAnsi="Arial" w:cs="Arial"/>
+                <w:sz w:val="16"/>
+                <w:szCs w:val="16"/>
+              </w:rPr>
+            </w:pPr>
+          </w:p>
+        </w:tc>
+        <w:tc>
+          <w:tcPr>
+            <w:tcW w:w="1799" w:type="dxa"/>
+            <w:vMerge/>
+            <w:vAlign w:val="center"/>
+          </w:tcPr>
+          <w:p>
+            <w:pPr>
+              <w:spacing w:before="20" w:after="20" w:line="240" w:lineRule="auto"/>
+              <w:jc w:val="center"/>
+              <w:rPr>
+                <w:rFonts w:ascii="Arial" w:hAnsi="Arial" w:cs="Arial"/>
+                <w:sz w:val="16"/>
+                <w:szCs w:val="16"/>
+              </w:rPr>
+            </w:pPr>
+          </w:p>
+        </w:tc>
+        <w:tc>
+          <w:tcPr>
+            <w:tcW w:w="820" w:type="dxa"/>
+            <w:vAlign w:val="center"/>
+          </w:tcPr>
+          <w:p>
+            <w:pPr>
+              <w:spacing w:before="20" w:after="20" w:line="240" w:lineRule="auto"/>
+              <w:jc w:val="center"/>
+              <w:rPr>
+                <w:rFonts w:ascii="Arial" w:hAnsi="Arial" w:cs="Arial"/>
+                <w:sz w:val="16"/>
+                <w:szCs w:val="16"/>
+              </w:rPr>
+            </w:pPr>
+            <w:r>
+              <w:rPr>
+                <w:rFonts w:ascii="Arial" w:hAnsi="Arial" w:cs="Arial"/>
+                <w:sz w:val="16"/>
+                <w:szCs w:val="16"/>
+              </w:rPr>
+              <w:t xml:space="preserve">Fahrzeit</w:t>
+            </w:r>
+          </w:p>
+        </w:tc>
+        <w:tc>
+          <w:tcPr>
+            <w:tcW w:w="700" w:type="dxa"/>
+            <w:vAlign w:val="center"/>
+          </w:tcPr>
+          <w:p>
+            <w:pPr>
+              <w:spacing w:before="20" w:after="20" w:line="240" w:lineRule="auto"/>
+              <w:jc w:val="center"/>
+              <w:rPr>
+                <w:rFonts w:ascii="Arial" w:hAnsi="Arial" w:cs="Arial"/>
+                <w:sz w:val="16"/>
+                <w:szCs w:val="16"/>
+              </w:rPr>
+            </w:pPr>
+            <w:r>
+              <w:rPr>
+                <w:rFonts w:ascii="Arial" w:hAnsi="Arial" w:cs="Arial"/>
+                <w:sz w:val="16"/>
+                <w:szCs w:val="16"/>
+              </w:rPr>
+              <w:t xml:space="preserve">Km</w:t>
+            </w:r>
+          </w:p>
+        </w:tc>
+        <w:tc>
+          <w:tcPr>
+            <w:tcW w:w="820" w:type="dxa"/>
+            <w:vAlign w:val="center"/>
+          </w:tcPr>
+          <w:p>
+            <w:pPr>
+              <w:spacing w:before="20" w:after="20" w:line="240" w:lineRule="auto"/>
+              <w:jc w:val="center"/>
+              <w:rPr>
+                <w:rFonts w:ascii="Arial" w:hAnsi="Arial" w:cs="Arial"/>
+                <w:sz w:val="16"/>
+                <w:szCs w:val="16"/>
+              </w:rPr>
+            </w:pPr>
+            <w:r>
+              <w:rPr>
+                <w:rFonts w:ascii="Arial" w:hAnsi="Arial" w:cs="Arial"/>
+                <w:sz w:val="16"/>
+                <w:szCs w:val="16"/>
+              </w:rPr>
+              <w:t xml:space="preserve">von</w:t>
+            </w:r>
+          </w:p>
+        </w:tc>
+        <w:tc>
+          <w:tcPr>
+            <w:tcW w:w="820" w:type="dxa"/>
+            <w:vAlign w:val="center"/>
+          </w:tcPr>
+          <w:p>
+            <w:pPr>
+              <w:spacing w:before="20" w:after="20" w:line="240" w:lineRule="auto"/>
+              <w:jc w:val="center"/>
+              <w:rPr>
+                <w:rFonts w:ascii="Arial" w:hAnsi="Arial" w:cs="Arial"/>
+                <w:sz w:val="16"/>
+                <w:szCs w:val="16"/>
+              </w:rPr>
+            </w:pPr>
+            <w:r>
+              <w:rPr>
+                <w:rFonts w:ascii="Arial" w:hAnsi="Arial" w:cs="Arial"/>
+                <w:sz w:val="16"/>
+                <w:szCs w:val="16"/>
+              </w:rPr>
+              <w:t xml:space="preserve">bis</w:t>
+            </w:r>
+          </w:p>
+        </w:tc>
+        <w:tc>
+          <w:tcPr>
+            <w:tcW w:w="900" w:type="dxa"/>
+            <w:vAlign w:val="center"/>
+          </w:tcPr>
+          <w:p>
+            <w:pPr>
+              <w:spacing w:before="20" w:after="20" w:line="240" w:lineRule="auto"/>
+              <w:jc w:val="center"/>
+              <w:rPr>
+                <w:rFonts w:ascii="Arial" w:hAnsi="Arial" w:cs="Arial"/>
+                <w:sz w:val="16"/>
+                <w:szCs w:val="16"/>
+              </w:rPr>
+            </w:pPr>
+            <w:r>
+              <w:rPr>
+                <w:rFonts w:ascii="Arial" w:hAnsi="Arial" w:cs="Arial"/>
+                <w:sz w:val="16"/>
+                <w:szCs w:val="16"/>
+              </w:rPr>
+              <w:t xml:space="preserve">Stunden</w:t>
+            </w:r>
+          </w:p>
+        </w:tc>
+        <w:tc>
+          <w:tcPr>
+            <w:tcW w:w="820" w:type="dxa"/>
+            <w:vAlign w:val="center"/>
+          </w:tcPr>
+          <w:p>
+            <w:pPr>
+              <w:spacing w:before="20" w:after="20" w:line="240" w:lineRule="auto"/>
+              <w:jc w:val="center"/>
+              <w:rPr>
+                <w:rFonts w:ascii="Arial" w:hAnsi="Arial" w:cs="Arial"/>
+                <w:sz w:val="16"/>
+                <w:szCs w:val="16"/>
+              </w:rPr>
+            </w:pPr>
+            <w:r>
+              <w:rPr>
+                <w:rFonts w:ascii="Arial" w:hAnsi="Arial" w:cs="Arial"/>
+                <w:sz w:val="16"/>
+                <w:szCs w:val="16"/>
+              </w:rPr>
+              <w:t xml:space="preserve">Ü-Std.</w:t>
+            </w:r>
+          </w:p>
+        </w:tc>
+        <w:tc>
+          <w:tcPr>
+            <w:tcW w:w="820" w:type="dxa"/>
+            <w:vAlign w:val="center"/>
+          </w:tcPr>
+          <w:p>
+            <w:pPr>
+              <w:spacing w:before="20" w:after="20" w:line="240" w:lineRule="auto"/>
+              <w:jc w:val="center"/>
+              <w:rPr>
+                <w:rFonts w:ascii="Arial" w:hAnsi="Arial" w:cs="Arial"/>
+                <w:sz w:val="16"/>
+                <w:szCs w:val="16"/>
+              </w:rPr>
+            </w:pPr>
+            <w:r>
+              <w:rPr>
+                <w:rFonts w:ascii="Arial" w:hAnsi="Arial" w:cs="Arial"/>
+                <w:sz w:val="16"/>
+                <w:szCs w:val="16"/>
+              </w:rPr>
+              <w:t xml:space="preserve">Pause</w:t>
+            </w:r>
+          </w:p>
+        </w:tc>
+        <w:tc>
+          <w:tcPr>
+            <w:tcW w:w="820" w:type="dxa"/>
+            <w:vAlign w:val="center"/>
+          </w:tcPr>
+          <w:p>
+            <w:pPr>
+              <w:spacing w:before="20" w:after="20" w:line="240" w:lineRule="auto"/>
+              <w:jc w:val="center"/>
+              <w:rPr>
+                <w:rFonts w:ascii="Arial" w:hAnsi="Arial" w:cs="Arial"/>
+                <w:sz w:val="16"/>
+                <w:szCs w:val="16"/>
+              </w:rPr>
+            </w:pPr>
+            <w:r>
+              <w:rPr>
+                <w:rFonts w:ascii="Arial" w:hAnsi="Arial" w:cs="Arial"/>
+                <w:sz w:val="16"/>
+                <w:szCs w:val="16"/>
+              </w:rPr>
+              <w:t xml:space="preserve">Fahrzeit</w:t>
+            </w:r>
+          </w:p>
+        </w:tc>
+        <w:tc>
+          <w:tcPr>
+            <w:tcW w:w="700" w:type="dxa"/>
+            <w:vAlign w:val="center"/>
+          </w:tcPr>
+          <w:p>
+            <w:pPr>
+              <w:spacing w:before="20" w:after="20" w:line="240" w:lineRule="auto"/>
+              <w:jc w:val="center"/>
+              <w:rPr>
+                <w:rFonts w:ascii="Arial" w:hAnsi="Arial" w:cs="Arial"/>
+                <w:sz w:val="16"/>
+                <w:szCs w:val="16"/>
+              </w:rPr>
+            </w:pPr>
+            <w:r>
+              <w:rPr>
+                <w:rFonts w:ascii="Arial" w:hAnsi="Arial" w:cs="Arial"/>
+                <w:sz w:val="16"/>
+                <w:szCs w:val="16"/>
+              </w:rPr>
+              <w:t xml:space="preserve">Km</w:t>
+            </w:r>
+          </w:p>
+        </w:tc>
+      </w:tr>
+      <w:tr>
+        <w:trPr>
+          <w:cantSplit/>
+        </w:trPr>
+        <w:tc>
+          <w:tcPr>
+            <w:tcW w:w="1060" w:type="dxa"/>
+            <w:vAlign w:val="center"/>
+          </w:tcPr>
+          <w:p>
+            <w:pPr>
+              <w:spacing w:before="20" w:after="20" w:line="240" w:lineRule="auto"/>
+              <w:jc w:val="center"/>
+              <w:rPr>
+                <w:rFonts w:ascii="Arial" w:hAnsi="Arial" w:cs="Arial"/>
+                <w:sz w:val="16"/>
+                <w:szCs w:val="16"/>
+              </w:rPr>
+            </w:pPr>
+            <w:r>
+              <w:rPr>
+                <w:rFonts w:ascii="Arial" w:hAnsi="Arial" w:cs="Arial"/>
+                <w:sz w:val="16"/>
+                <w:szCs w:val="16"/>
+              </w:rPr>
+              <w:t xml:space="preserve">{#timeRows}{date}</w:t>
+            </w:r>
+          </w:p>
+        </w:tc>
+        <w:tc>
+          <w:tcPr>
+            <w:tcW w:w="1799" w:type="dxa"/>
+            <w:vAlign w:val="center"/>
+          </w:tcPr>
+          <w:p>
+            <w:pPr>
+              <w:spacing w:before="20" w:after="20" w:line="240" w:lineRule="auto"/>
+              <w:jc w:val="left"/>
+              <w:rPr>
+                <w:rFonts w:ascii="Arial" w:hAnsi="Arial" w:cs="Arial"/>
+                <w:sz w:val="16"/>
+                <w:szCs w:val="16"/>
+              </w:rPr>
+            </w:pPr>
+            <w:r>
+              <w:rPr>
+                <w:rFonts w:ascii="Arial" w:hAnsi="Arial" w:cs="Arial"/>
+                <w:sz w:val="16"/>
+                <w:szCs w:val="16"/>
+              </w:rPr>
+              <w:t xml:space="preserve">{technician}</w:t>
+            </w:r>
+          </w:p>
+        </w:tc>
+        <w:tc>
+          <w:tcPr>
+            <w:tcW w:w="820" w:type="dxa"/>
+            <w:vAlign w:val="center"/>
+          </w:tcPr>
+          <w:p>
+            <w:pPr>
+              <w:spacing w:before="20" w:after="20" w:line="240" w:lineRule="auto"/>
+              <w:jc w:val="center"/>
+              <w:rPr>
+                <w:rFonts w:ascii="Arial" w:hAnsi="Arial" w:cs="Arial"/>
+                <w:sz w:val="16"/>
+                <w:szCs w:val="16"/>
+              </w:rPr>
+            </w:pPr>
+            <w:r>
+              <w:rPr>
+                <w:rFonts w:ascii="Arial" w:hAnsi="Arial" w:cs="Arial"/>
+                <w:sz w:val="16"/>
+                <w:szCs w:val="16"/>
+              </w:rPr>
+              <w:t xml:space="preserve">{outboundTravel}</w:t>
+            </w:r>
+          </w:p>
+        </w:tc>
+        <w:tc>
+          <w:tcPr>
+            <w:tcW w:w="700" w:type="dxa"/>
+            <w:vAlign w:val="center"/>
+          </w:tcPr>
+          <w:p>
+            <w:pPr>
+              <w:spacing w:before="20" w:after="20" w:line="240" w:lineRule="auto"/>
+              <w:jc w:val="center"/>
+              <w:rPr>
+                <w:rFonts w:ascii="Arial" w:hAnsi="Arial" w:cs="Arial"/>
+                <w:sz w:val="16"/>
+                <w:szCs w:val="16"/>
+              </w:rPr>
+            </w:pPr>
+            <w:r>
+              <w:rPr>
+                <w:rFonts w:ascii="Arial" w:hAnsi="Arial" w:cs="Arial"/>
+                <w:sz w:val="16"/>
+                <w:szCs w:val="16"/>
+              </w:rPr>
+              <w:t xml:space="preserve">{outboundKm}</w:t>
+            </w:r>
+          </w:p>
+        </w:tc>
+        <w:tc>
+          <w:tcPr>
+            <w:tcW w:w="820" w:type="dxa"/>
+            <w:vAlign w:val="center"/>
+          </w:tcPr>
+          <w:p>
+            <w:pPr>
+              <w:spacing w:before="20" w:after="20" w:line="240" w:lineRule="auto"/>
+              <w:jc w:val="center"/>
+              <w:rPr>
+                <w:rFonts w:ascii="Arial" w:hAnsi="Arial" w:cs="Arial"/>
+                <w:sz w:val="16"/>
+                <w:szCs w:val="16"/>
+              </w:rPr>
+            </w:pPr>
+            <w:r>
+              <w:rPr>
+                <w:rFonts w:ascii="Arial" w:hAnsi="Arial" w:cs="Arial"/>
+                <w:sz w:val="16"/>
+                <w:szCs w:val="16"/>
+              </w:rPr>
+              <w:t xml:space="preserve">{from}</w:t>
+            </w:r>
+          </w:p>
+        </w:tc>
+        <w:tc>
+          <w:tcPr>
+            <w:tcW w:w="820" w:type="dxa"/>
+            <w:vAlign w:val="center"/>
+          </w:tcPr>
+          <w:p>
+            <w:pPr>
+              <w:spacing w:before="20" w:after="20" w:line="240" w:lineRule="auto"/>
+              <w:jc w:val="center"/>
+              <w:rPr>
+                <w:rFonts w:ascii="Arial" w:hAnsi="Arial" w:cs="Arial"/>
+                <w:sz w:val="16"/>
+                <w:szCs w:val="16"/>
+              </w:rPr>
+            </w:pPr>
+            <w:r>
+              <w:rPr>
+                <w:rFonts w:ascii="Arial" w:hAnsi="Arial" w:cs="Arial"/>
+                <w:sz w:val="16"/>
+                <w:szCs w:val="16"/>
+              </w:rPr>
+              <w:t xml:space="preserve">{to}</w:t>
+            </w:r>
+          </w:p>
+        </w:tc>
+        <w:tc>
+          <w:tcPr>
+            <w:tcW w:w="900" w:type="dxa"/>
+            <w:vAlign w:val="center"/>
+          </w:tcPr>
+          <w:p>
+            <w:pPr>
+              <w:spacing w:before="20" w:after="20" w:line="240" w:lineRule="auto"/>
+              <w:jc w:val="center"/>
+              <w:rPr>
+                <w:rFonts w:ascii="Arial" w:hAnsi="Arial" w:cs="Arial"/>
+                <w:sz w:val="16"/>
+                <w:szCs w:val="16"/>
+              </w:rPr>
+            </w:pPr>
+            <w:r>
+              <w:rPr>
+                <w:rFonts w:ascii="Arial" w:hAnsi="Arial" w:cs="Arial"/>
+                <w:sz w:val="16"/>
+                <w:szCs w:val="16"/>
+              </w:rPr>
+              <w:t xml:space="preserve">{hours}</w:t>
+            </w:r>
+          </w:p>
+        </w:tc>
+        <w:tc>
+          <w:tcPr>
+            <w:tcW w:w="820" w:type="dxa"/>
+            <w:vAlign w:val="center"/>
+          </w:tcPr>
+          <w:p>
+            <w:pPr>
+              <w:spacing w:before="20" w:after="20" w:line="240" w:lineRule="auto"/>
+              <w:jc w:val="center"/>
+              <w:rPr>
+                <w:rFonts w:ascii="Arial" w:hAnsi="Arial" w:cs="Arial"/>
+                <w:sz w:val="16"/>
+                <w:szCs w:val="16"/>
+              </w:rPr>
+            </w:pPr>
+            <w:r>
+              <w:rPr>
+                <w:rFonts w:ascii="Arial" w:hAnsi="Arial" w:cs="Arial"/>
+                <w:sz w:val="16"/>
+                <w:szCs w:val="16"/>
+              </w:rPr>
+              <w:t xml:space="preserve">{overtime}</w:t>
+            </w:r>
+          </w:p>
+        </w:tc>
+        <w:tc>
+          <w:tcPr>
+            <w:tcW w:w="820" w:type="dxa"/>
+            <w:vAlign w:val="center"/>
+          </w:tcPr>
+          <w:p>
+            <w:pPr>
+              <w:spacing w:before="20" w:after="20" w:line="240" w:lineRule="auto"/>
+              <w:jc w:val="center"/>
+              <w:rPr>
+                <w:rFonts w:ascii="Arial" w:hAnsi="Arial" w:cs="Arial"/>
+                <w:sz w:val="16"/>
+                <w:szCs w:val="16"/>
+              </w:rPr>
+            </w:pPr>
+            <w:r>
+              <w:rPr>
+                <w:rFonts w:ascii="Arial" w:hAnsi="Arial" w:cs="Arial"/>
+                <w:sz w:val="16"/>
+                <w:szCs w:val="16"/>
+              </w:rPr>
+              <w:t xml:space="preserve">{pause}</w:t>
+            </w:r>
+          </w:p>
+        </w:tc>
+        <w:tc>
+          <w:tcPr>
+            <w:tcW w:w="820" w:type="dxa"/>
+            <w:vAlign w:val="center"/>
+          </w:tcPr>
+          <w:p>
+            <w:pPr>
+              <w:spacing w:before="20" w:after="20" w:line="240" w:lineRule="auto"/>
+              <w:jc w:val="center"/>
+              <w:rPr>
+                <w:rFonts w:ascii="Arial" w:hAnsi="Arial" w:cs="Arial"/>
+                <w:sz w:val="16"/>
+                <w:szCs w:val="16"/>
+              </w:rPr>
+            </w:pPr>
+            <w:r>
+              <w:rPr>
+                <w:rFonts w:ascii="Arial" w:hAnsi="Arial" w:cs="Arial"/>
+                <w:sz w:val="16"/>
+                <w:szCs w:val="16"/>
+              </w:rPr>
+              <w:t xml:space="preserve">{returnTravel}</w:t>
+            </w:r>
+          </w:p>
+        </w:tc>
+        <w:tc>
+          <w:tcPr>
+            <w:tcW w:w="700" w:type="dxa"/>
+            <w:vAlign w:val="center"/>
+          </w:tcPr>
+          <w:p>
+            <w:pPr>
+              <w:spacing w:before="20" w:after="20" w:line="240" w:lineRule="auto"/>
+              <w:jc w:val="center"/>
+              <w:rPr>
+                <w:rFonts w:ascii="Arial" w:hAnsi="Arial" w:cs="Arial"/>
+                <w:sz w:val="16"/>
+                <w:szCs w:val="16"/>
+              </w:rPr>
+            </w:pPr>
+            <w:r>
+              <w:rPr>
+                <w:rFonts w:ascii="Arial" w:hAnsi="Arial" w:cs="Arial"/>
+                <w:sz w:val="16"/>
+                <w:szCs w:val="16"/>
+              </w:rPr>
+              <w:t xml:space="preserve">{returnKm}{/timeRows}</w:t>
+            </w:r>
+          </w:p>
+        </w:tc>
+      </w:tr>
+      <w:tr>
+        <w:trPr>
+          <w:cantSplit/>
+        </w:trPr>
+        <w:tc>
+          <w:tcPr>
+            <w:tcW w:w="2859" w:type="dxa"/>
+            <w:gridSpan w:val="2"/>
+            <w:vAlign w:val="center"/>
+          </w:tcPr>
+          <w:p>
+            <w:pPr>
+              <w:spacing w:before="20" w:after="20" w:line="240" w:lineRule="auto"/>
+              <w:jc w:val="left"/>
+              <w:rPr>
+                <w:rFonts w:ascii="Arial" w:hAnsi="Arial" w:cs="Arial"/>
+                <w:b/>
+                <w:bCs/>
+                <w:sz w:val="16"/>
+                <w:szCs w:val="16"/>
+              </w:rPr>
+            </w:pPr>
+            <w:r>
+              <w:rPr>
+                <w:rFonts w:ascii="Arial" w:hAnsi="Arial" w:cs="Arial"/>
+                <w:b/>
+                <w:bCs/>
+                <w:sz w:val="16"/>
+                <w:szCs w:val="16"/>
+              </w:rPr>
+              <w:t xml:space="preserve">Gesamt:</w:t>
+            </w:r>
+          </w:p>
+        </w:tc>
+        <w:tc>
+          <w:tcPr>
+            <w:tcW w:w="820" w:type="dxa"/>
+            <w:vAlign w:val="center"/>
+          </w:tcPr>
+          <w:p>
+            <w:pPr>
+              <w:spacing w:before="20" w:after="20" w:line="240" w:lineRule="auto"/>
+              <w:jc w:val="center"/>
+              <w:rPr>
+                <w:rFonts w:ascii="Arial" w:hAnsi="Arial" w:cs="Arial"/>
+                <w:b/>
+                <w:bCs/>
+                <w:sz w:val="16"/>
+                <w:szCs w:val="16"/>
+              </w:rPr>
+            </w:pPr>
+            <w:r>
+              <w:rPr>
+                <w:rFonts w:ascii="Arial" w:hAnsi="Arial" w:cs="Arial"/>
+                <w:b/>
+                <w:bCs/>
+                <w:sz w:val="16"/>
+                <w:szCs w:val="16"/>
+              </w:rPr>
+              <w:t xml:space="preserve">{totalOutboundTravel}</w:t>
+            </w:r>
+          </w:p>
+        </w:tc>
+        <w:tc>
+          <w:tcPr>
+            <w:tcW w:w="700" w:type="dxa"/>
+            <w:vAlign w:val="center"/>
+          </w:tcPr>
+          <w:p>
+            <w:pPr>
+              <w:spacing w:before="20" w:after="20" w:line="240" w:lineRule="auto"/>
+              <w:jc w:val="center"/>
+              <w:rPr>
+                <w:rFonts w:ascii="Arial" w:hAnsi="Arial" w:cs="Arial"/>
+                <w:b/>
+                <w:bCs/>
+                <w:sz w:val="16"/>
+                <w:szCs w:val="16"/>
+              </w:rPr>
+            </w:pPr>
+            <w:r>
+              <w:rPr>
+                <w:rFonts w:ascii="Arial" w:hAnsi="Arial" w:cs="Arial"/>
+                <w:b/>
+                <w:bCs/>
+                <w:sz w:val="16"/>
+                <w:szCs w:val="16"/>
+              </w:rPr>
+              <w:t xml:space="preserve">{totalOutboundKm}</w:t>
+            </w:r>
+          </w:p>
+        </w:tc>
+        <w:tc>
+          <w:tcPr>
+            <w:tcW w:w="820" w:type="dxa"/>
+            <w:vAlign w:val="center"/>
+          </w:tcPr>
+          <w:p>
+            <w:pPr>
+              <w:spacing w:before="20" w:after="20" w:line="240" w:lineRule="auto"/>
+              <w:jc w:val="center"/>
+              <w:rPr>
+                <w:rFonts w:ascii="Arial" w:hAnsi="Arial" w:cs="Arial"/>
+                <w:sz w:val="16"/>
+                <w:szCs w:val="16"/>
+              </w:rPr>
+            </w:pPr>
+          </w:p>
+        </w:tc>
+        <w:tc>
+          <w:tcPr>
+            <w:tcW w:w="820" w:type="dxa"/>
+            <w:vAlign w:val="center"/>
+          </w:tcPr>
+          <w:p>
+            <w:pPr>
+              <w:spacing w:before="20" w:after="20" w:line="240" w:lineRule="auto"/>
+              <w:jc w:val="center"/>
+              <w:rPr>
+                <w:rFonts w:ascii="Arial" w:hAnsi="Arial" w:cs="Arial"/>
+                <w:sz w:val="16"/>
+                <w:szCs w:val="16"/>
+              </w:rPr>
+            </w:pPr>
+          </w:p>
+        </w:tc>
+        <w:tc>
+          <w:tcPr>
+            <w:tcW w:w="900" w:type="dxa"/>
+            <w:vAlign w:val="center"/>
+          </w:tcPr>
+          <w:p>
+            <w:pPr>
+              <w:spacing w:before="20" w:after="20" w:line="240" w:lineRule="auto"/>
+              <w:jc w:val="center"/>
+              <w:rPr>
+                <w:rFonts w:ascii="Arial" w:hAnsi="Arial" w:cs="Arial"/>
+                <w:b/>
+                <w:bCs/>
+                <w:sz w:val="16"/>
+                <w:szCs w:val="16"/>
+              </w:rPr>
+            </w:pPr>
+            <w:r>
+              <w:rPr>
+                <w:rFonts w:ascii="Arial" w:hAnsi="Arial" w:cs="Arial"/>
+                <w:b/>
+                <w:bCs/>
+                <w:sz w:val="16"/>
+                <w:szCs w:val="16"/>
+              </w:rPr>
+              <w:t xml:space="preserve">{totalHours}</w:t>
+            </w:r>
+          </w:p>
+        </w:tc>
+        <w:tc>
+          <w:tcPr>
+            <w:tcW w:w="820" w:type="dxa"/>
+            <w:vAlign w:val="center"/>
+          </w:tcPr>
+          <w:p>
+            <w:pPr>
+              <w:spacing w:before="20" w:after="20" w:line="240" w:lineRule="auto"/>
+              <w:jc w:val="center"/>
+              <w:rPr>
+                <w:rFonts w:ascii="Arial" w:hAnsi="Arial" w:cs="Arial"/>
+                <w:b/>
+                <w:bCs/>
+                <w:sz w:val="16"/>
+                <w:szCs w:val="16"/>
+              </w:rPr>
+            </w:pPr>
+            <w:r>
+              <w:rPr>
+                <w:rFonts w:ascii="Arial" w:hAnsi="Arial" w:cs="Arial"/>
+                <w:b/>
+                <w:bCs/>
+                <w:sz w:val="16"/>
+                <w:szCs w:val="16"/>
+              </w:rPr>
+              <w:t xml:space="preserve">{totalOvertime}</w:t>
+            </w:r>
+          </w:p>
+        </w:tc>
+        <w:tc>
+          <w:tcPr>
+            <w:tcW w:w="820" w:type="dxa"/>
+            <w:vAlign w:val="center"/>
+          </w:tcPr>
+          <w:p>
+            <w:pPr>
+              <w:spacing w:before="20" w:after="20" w:line="240" w:lineRule="auto"/>
+              <w:jc w:val="center"/>
+              <w:rPr>
+                <w:rFonts w:ascii="Arial" w:hAnsi="Arial" w:cs="Arial"/>
+                <w:sz w:val="16"/>
+                <w:szCs w:val="16"/>
+              </w:rPr>
+            </w:pPr>
+          </w:p>
+        </w:tc>
+        <w:tc>
+          <w:tcPr>
+            <w:tcW w:w="820" w:type="dxa"/>
+            <w:vAlign w:val="center"/>
+          </w:tcPr>
+          <w:p>
+            <w:pPr>
+              <w:spacing w:before="20" w:after="20" w:line="240" w:lineRule="auto"/>
+              <w:jc w:val="center"/>
+              <w:rPr>
+                <w:rFonts w:ascii="Arial" w:hAnsi="Arial" w:cs="Arial"/>
+                <w:b/>
+                <w:bCs/>
+                <w:sz w:val="16"/>
+                <w:szCs w:val="16"/>
+              </w:rPr>
+            </w:pPr>
+            <w:r>
+              <w:rPr>
+                <w:rFonts w:ascii="Arial" w:hAnsi="Arial" w:cs="Arial"/>
+                <w:b/>
+                <w:bCs/>
+                <w:sz w:val="16"/>
+                <w:szCs w:val="16"/>
+              </w:rPr>
+              <w:t xml:space="preserve">{totalReturnTravel}</w:t>
+            </w:r>
+          </w:p>
+        </w:tc>
+        <w:tc>
+          <w:tcPr>
+            <w:tcW w:w="700" w:type="dxa"/>
+            <w:vAlign w:val="center"/>
+          </w:tcPr>
+          <w:p>
+            <w:pPr>
+              <w:spacing w:before="20" w:after="20" w:line="240" w:lineRule="auto"/>
+              <w:jc w:val="center"/>
+              <w:rPr>
+                <w:rFonts w:ascii="Arial" w:hAnsi="Arial" w:cs="Arial"/>
+                <w:b/>
+                <w:bCs/>
+                <w:sz w:val="16"/>
+                <w:szCs w:val="16"/>
+              </w:rPr>
+            </w:pPr>
+            <w:r>
+              <w:rPr>
+                <w:rFonts w:ascii="Arial" w:hAnsi="Arial" w:cs="Arial"/>
+                <w:b/>
+                <w:bCs/>
+                <w:sz w:val="16"/>
+                <w:szCs w:val="16"/>
+              </w:rPr>
+              <w:t xml:space="preserve">{totalReturnKm}</w:t>
+            </w:r>
+          </w:p>
+        </w:tc>
+      </w:tr>
+    </w:tbl>
     <w:p>
       <w:pPr>
         <w:jc w:val="left"/>

</xml_diff>